<commit_message>
docs: update project report document
</commit_message>
<xml_diff>
--- a/docs/report_academic.docx
+++ b/docs/report_academic.docx
@@ -8171,7 +8171,7 @@
           <v:shape id="_x0000_i1034" type="#_x0000_t75" style="width:415.3pt;height:126.7pt" o:ole="">
             <v:imagedata r:id="rId14" o:title=""/>
           </v:shape>
-          <o:OLEObject Type="Embed" ProgID="Word.Document.12" ShapeID="_x0000_i1034" DrawAspect="Content" ObjectID="_1832094647" r:id="rId15">
+          <o:OLEObject Type="Embed" ProgID="Word.Document.12" ShapeID="_x0000_i1034" DrawAspect="Content" ObjectID="_1832095178" r:id="rId15">
             <o:FieldCodes>\s</o:FieldCodes>
           </o:OLEObject>
         </w:object>
@@ -8361,7 +8361,7 @@
           <v:shape id="_x0000_i1026" type="#_x0000_t75" style="width:415.3pt;height:142.55pt" o:ole="">
             <v:imagedata r:id="rId16" o:title=""/>
           </v:shape>
-          <o:OLEObject Type="Embed" ProgID="Word.Document.12" ShapeID="_x0000_i1026" DrawAspect="Content" ObjectID="_1832094648" r:id="rId17">
+          <o:OLEObject Type="Embed" ProgID="Word.Document.12" ShapeID="_x0000_i1026" DrawAspect="Content" ObjectID="_1832095179" r:id="rId17">
             <o:FieldCodes>\s</o:FieldCodes>
           </o:OLEObject>
         </w:object>
@@ -8491,7 +8491,7 @@
           <v:shape id="_x0000_i1027" type="#_x0000_t75" style="width:415.3pt;height:417.6pt" o:ole="">
             <v:imagedata r:id="rId18" o:title=""/>
           </v:shape>
-          <o:OLEObject Type="Embed" ProgID="Word.Document.12" ShapeID="_x0000_i1027" DrawAspect="Content" ObjectID="_1832094649" r:id="rId19">
+          <o:OLEObject Type="Embed" ProgID="Word.Document.12" ShapeID="_x0000_i1027" DrawAspect="Content" ObjectID="_1832095180" r:id="rId19">
             <o:FieldCodes>\s</o:FieldCodes>
           </o:OLEObject>
         </w:object>
@@ -9232,6 +9232,56 @@
       <w:r>
         <w:t xml:space="preserve"> </w:t>
       </w:r>
+      <w:r>
+        <w:t>To handle filesystem events, the service defines dedicated handler functions for each event type,</w:t>
+      </w:r>
+      <w:r>
+        <w:t xml:space="preserve"> which are </w:t>
+      </w:r>
+      <w:proofErr w:type="spellStart"/>
+      <w:r>
+        <w:rPr>
+          <w:rStyle w:val="Code0"/>
+        </w:rPr>
+        <w:t>onCreated</w:t>
+      </w:r>
+      <w:proofErr w:type="spellEnd"/>
+      <w:r>
+        <w:t xml:space="preserve">, </w:t>
+      </w:r>
+      <w:proofErr w:type="spellStart"/>
+      <w:r>
+        <w:rPr>
+          <w:rStyle w:val="Code0"/>
+        </w:rPr>
+        <w:t>onDeleted</w:t>
+      </w:r>
+      <w:proofErr w:type="spellEnd"/>
+      <w:r>
+        <w:t xml:space="preserve">, </w:t>
+      </w:r>
+      <w:proofErr w:type="spellStart"/>
+      <w:r>
+        <w:rPr>
+          <w:rStyle w:val="Code0"/>
+        </w:rPr>
+        <w:t>onRenamed</w:t>
+      </w:r>
+      <w:proofErr w:type="spellEnd"/>
+      <w:r>
+        <w:t xml:space="preserve">, and </w:t>
+      </w:r>
+      <w:proofErr w:type="spellStart"/>
+      <w:r>
+        <w:rPr>
+          <w:rStyle w:val="Code0"/>
+        </w:rPr>
+        <w:t>onError</w:t>
+      </w:r>
+      <w:proofErr w:type="spellEnd"/>
+      <w:r>
+        <w:t>.</w:t>
+      </w:r>
     </w:p>
     <w:p>
       <w:r>
@@ -9377,6 +9427,7 @@
         </w:numPr>
       </w:pPr>
       <w:r>
+        <w:lastRenderedPageBreak/>
         <w:t>Streaming terminal output to clients</w:t>
       </w:r>
     </w:p>
@@ -9401,7 +9452,6 @@
         </w:numPr>
       </w:pPr>
       <w:r>
-        <w:lastRenderedPageBreak/>
         <w:t>Managing process lifecycle and shutdown</w:t>
       </w:r>
     </w:p>

</xml_diff>

<commit_message>
fix(file-watcher): add lock for atomic operation to avoid data race docs: update project document
</commit_message>
<xml_diff>
--- a/docs/report_academic.docx
+++ b/docs/report_academic.docx
@@ -3121,21 +3121,7 @@
                 <w:rStyle w:val="af0"/>
                 <w:noProof/>
               </w:rPr>
-              <w:t>Servi</w:t>
-            </w:r>
-            <w:r>
-              <w:rPr>
-                <w:rStyle w:val="af0"/>
-                <w:noProof/>
-              </w:rPr>
-              <w:t>c</w:t>
-            </w:r>
-            <w:r>
-              <w:rPr>
-                <w:rStyle w:val="af0"/>
-                <w:noProof/>
-              </w:rPr>
-              <w:t>es</w:t>
+              <w:t>Services</w:t>
             </w:r>
             <w:r>
               <w:rPr>
@@ -8168,10 +8154,10 @@
             <v:path o:extrusionok="f" gradientshapeok="t" o:connecttype="rect"/>
             <o:lock v:ext="edit" aspectratio="t"/>
           </v:shapetype>
-          <v:shape id="_x0000_i1034" type="#_x0000_t75" style="width:415.3pt;height:126.7pt" o:ole="">
+          <v:shape id="_x0000_i1025" type="#_x0000_t75" style="width:415.5pt;height:126.75pt" o:ole="">
             <v:imagedata r:id="rId14" o:title=""/>
           </v:shape>
-          <o:OLEObject Type="Embed" ProgID="Word.Document.12" ShapeID="_x0000_i1034" DrawAspect="Content" ObjectID="_1832095178" r:id="rId15">
+          <o:OLEObject Type="Embed" ProgID="Word.Document.12" ShapeID="_x0000_i1025" DrawAspect="Content" ObjectID="_1832182597" r:id="rId15">
             <o:FieldCodes>\s</o:FieldCodes>
           </o:OLEObject>
         </w:object>
@@ -8358,10 +8344,10 @@
       </w:pPr>
       <w:r>
         <w:object w:dxaOrig="8306" w:dyaOrig="2851" w14:anchorId="170D8F50">
-          <v:shape id="_x0000_i1026" type="#_x0000_t75" style="width:415.3pt;height:142.55pt" o:ole="">
+          <v:shape id="_x0000_i1026" type="#_x0000_t75" style="width:415.5pt;height:142.5pt" o:ole="">
             <v:imagedata r:id="rId16" o:title=""/>
           </v:shape>
-          <o:OLEObject Type="Embed" ProgID="Word.Document.12" ShapeID="_x0000_i1026" DrawAspect="Content" ObjectID="_1832095179" r:id="rId17">
+          <o:OLEObject Type="Embed" ProgID="Word.Document.12" ShapeID="_x0000_i1026" DrawAspect="Content" ObjectID="_1832182598" r:id="rId17">
             <o:FieldCodes>\s</o:FieldCodes>
           </o:OLEObject>
         </w:object>
@@ -8488,10 +8474,10 @@
           <w:rFonts w:cs="Times New Roman"/>
         </w:rPr>
         <w:object w:dxaOrig="8306" w:dyaOrig="8352" w14:anchorId="7F211194">
-          <v:shape id="_x0000_i1027" type="#_x0000_t75" style="width:415.3pt;height:417.6pt" o:ole="">
+          <v:shape id="_x0000_i1027" type="#_x0000_t75" style="width:415.5pt;height:417.75pt" o:ole="">
             <v:imagedata r:id="rId18" o:title=""/>
           </v:shape>
-          <o:OLEObject Type="Embed" ProgID="Word.Document.12" ShapeID="_x0000_i1027" DrawAspect="Content" ObjectID="_1832095180" r:id="rId19">
+          <o:OLEObject Type="Embed" ProgID="Word.Document.12" ShapeID="_x0000_i1027" DrawAspect="Content" ObjectID="_1832182599" r:id="rId19">
             <o:FieldCodes>\s</o:FieldCodes>
           </o:OLEObject>
         </w:object>
@@ -9109,19 +9095,7 @@
     </w:p>
     <w:p>
       <w:r>
-        <w:t xml:space="preserve">  </w:t>
-      </w:r>
-      <w:r>
-        <w:t>Before filesystem events can be monitored, the watcher must be initialised.</w:t>
-      </w:r>
-      <w:r>
-        <w:t xml:space="preserve"> </w:t>
-      </w:r>
-      <w:r>
-        <w:t>Therefore, the service provides two dedicated functions,</w:t>
-      </w:r>
-      <w:r>
-        <w:t xml:space="preserve"> </w:t>
+        <w:t xml:space="preserve">  Before filesystem events can be monitored, the watcher must be initialised. Therefore, the service provides two dedicated functions, </w:t>
       </w:r>
       <w:proofErr w:type="spellStart"/>
       <w:r>
@@ -9282,10 +9256,42 @@
       <w:r>
         <w:t>.</w:t>
       </w:r>
-    </w:p>
-    <w:p>
-      <w:r>
-        <w:t xml:space="preserve">Because of the way </w:t>
+      <w:r>
+        <w:t xml:space="preserve"> </w:t>
+      </w:r>
+      <w:r>
+        <w:t xml:space="preserve">Because the service is designed </w:t>
+      </w:r>
+      <w:r>
+        <w:t>to return the paths of dirty directories</w:t>
+      </w:r>
+      <w:r>
+        <w:t xml:space="preserve">, the function </w:t>
+      </w:r>
+      <w:proofErr w:type="spellStart"/>
+      <w:r>
+        <w:rPr>
+          <w:rStyle w:val="Code0"/>
+        </w:rPr>
+        <w:t>MarkDirectoryDirty</w:t>
+      </w:r>
+      <w:proofErr w:type="spellEnd"/>
+      <w:r>
+        <w:t xml:space="preserve"> is implemented for </w:t>
+      </w:r>
+      <w:r>
+        <w:t>invocation by the filesystem event handlers.</w:t>
+      </w:r>
+      <w:r>
+        <w:t xml:space="preserve"> </w:t>
+      </w:r>
+    </w:p>
+    <w:p>
+      <w:r>
+        <w:t>Due to</w:t>
+      </w:r>
+      <w:r>
+        <w:t xml:space="preserve"> the way </w:t>
       </w:r>
       <w:r>
         <w:t xml:space="preserve">Windows </w:t>
@@ -9297,72 +9303,138 @@
         <w:t xml:space="preserve"> </w:t>
       </w:r>
       <w:r>
-        <w:t xml:space="preserve">FileWatcherService </w:t>
-      </w:r>
-      <w:r>
-        <w:t>acts as a normalization layer</w:t>
-      </w:r>
-      <w:r>
-        <w:t xml:space="preserve">, </w:t>
-      </w:r>
-      <w:r>
-        <w:t xml:space="preserve">monitors directories for </w:t>
-      </w:r>
-      <w:r>
-        <w:t xml:space="preserve">file </w:t>
-      </w:r>
-      <w:r>
-        <w:t>changes</w:t>
-      </w:r>
+        <w:rPr>
+          <w:rFonts w:hint="eastAsia"/>
+        </w:rPr>
+        <w:t>There</w:t>
+      </w:r>
+      <w:r>
+        <w:t xml:space="preserve">fore, the </w:t>
+      </w:r>
+      <w:proofErr w:type="spellStart"/>
+      <w:r>
+        <w:rPr>
+          <w:rStyle w:val="Code0"/>
+        </w:rPr>
+        <w:t>MarkDirectoryDirty</w:t>
+      </w:r>
+      <w:proofErr w:type="spellEnd"/>
       <w:r>
         <w:t xml:space="preserve"> </w:t>
       </w:r>
       <w:r>
-        <w:t>and emits debounced filesystem events</w:t>
-      </w:r>
-      <w:r>
-        <w:t>.</w:t>
-      </w:r>
-    </w:p>
-    <w:p>
-      <w:r>
-        <w:t>Responsibilities:</w:t>
-      </w:r>
-    </w:p>
-    <w:p>
-      <w:pPr>
-        <w:pStyle w:val="a9"/>
-        <w:numPr>
-          <w:ilvl w:val="0"/>
-          <w:numId w:val="22"/>
-        </w:numPr>
-      </w:pPr>
-      <w:r>
-        <w:t>Watching directories for file creation, modification, and deletion</w:t>
-      </w:r>
-    </w:p>
-    <w:p>
-      <w:pPr>
-        <w:pStyle w:val="a9"/>
-        <w:numPr>
-          <w:ilvl w:val="0"/>
-          <w:numId w:val="22"/>
-        </w:numPr>
-      </w:pPr>
-      <w:r>
-        <w:t>Debouncing and merging rapid change events</w:t>
-      </w:r>
-    </w:p>
-    <w:p>
-      <w:pPr>
-        <w:pStyle w:val="a9"/>
-        <w:numPr>
-          <w:ilvl w:val="0"/>
-          <w:numId w:val="22"/>
-        </w:numPr>
-      </w:pPr>
-      <w:r>
-        <w:t>Return paths of dirty directories</w:t>
+        <w:t>function also acts</w:t>
+      </w:r>
+      <w:r>
+        <w:t xml:space="preserve"> as a normali</w:t>
+      </w:r>
+      <w:r>
+        <w:t>s</w:t>
+      </w:r>
+      <w:r>
+        <w:t>ation layer</w:t>
+      </w:r>
+      <w:r>
+        <w:t xml:space="preserve"> that</w:t>
+      </w:r>
+      <w:r>
+        <w:t xml:space="preserve"> </w:t>
+      </w:r>
+      <w:r>
+        <w:t>collects discrete filesystem events and performs debouncing and merging.</w:t>
+      </w:r>
+    </w:p>
+    <w:p>
+      <w:pPr>
+        <w:keepNext/>
+        <w:jc w:val="center"/>
+      </w:pPr>
+      <w:r>
+        <w:rPr>
+          <w:rFonts w:hint="eastAsia"/>
+          <w:noProof/>
+        </w:rPr>
+        <w:lastRenderedPageBreak/>
+        <w:drawing>
+          <wp:inline distT="0" distB="0" distL="0" distR="0" wp14:anchorId="3614B339" wp14:editId="5B480FFA">
+            <wp:extent cx="2614727" cy="2714625"/>
+            <wp:effectExtent l="0" t="0" r="0" b="0"/>
+            <wp:docPr id="7" name="图片 7"/>
+            <wp:cNvGraphicFramePr>
+              <a:graphicFrameLocks xmlns:a="http://schemas.openxmlformats.org/drawingml/2006/main" noChangeAspect="1"/>
+            </wp:cNvGraphicFramePr>
+            <a:graphic xmlns:a="http://schemas.openxmlformats.org/drawingml/2006/main">
+              <a:graphicData uri="http://schemas.openxmlformats.org/drawingml/2006/picture">
+                <pic:pic xmlns:pic="http://schemas.openxmlformats.org/drawingml/2006/picture">
+                  <pic:nvPicPr>
+                    <pic:cNvPr id="0" name="Picture 6"/>
+                    <pic:cNvPicPr>
+                      <a:picLocks noChangeAspect="1" noChangeArrowheads="1"/>
+                    </pic:cNvPicPr>
+                  </pic:nvPicPr>
+                  <pic:blipFill>
+                    <a:blip r:embed="rId21" cstate="print">
+                      <a:extLst>
+                        <a:ext uri="{28A0092B-C50C-407E-A947-70E740481C1C}">
+                          <a14:useLocalDpi xmlns:a14="http://schemas.microsoft.com/office/drawing/2010/main" val="0"/>
+                        </a:ext>
+                      </a:extLst>
+                    </a:blip>
+                    <a:srcRect/>
+                    <a:stretch>
+                      <a:fillRect/>
+                    </a:stretch>
+                  </pic:blipFill>
+                  <pic:spPr bwMode="auto">
+                    <a:xfrm>
+                      <a:off x="0" y="0"/>
+                      <a:ext cx="2623989" cy="2724240"/>
+                    </a:xfrm>
+                    <a:prstGeom prst="rect">
+                      <a:avLst/>
+                    </a:prstGeom>
+                    <a:noFill/>
+                    <a:ln>
+                      <a:noFill/>
+                    </a:ln>
+                  </pic:spPr>
+                </pic:pic>
+              </a:graphicData>
+            </a:graphic>
+          </wp:inline>
+        </w:drawing>
+      </w:r>
+    </w:p>
+    <w:p>
+      <w:pPr>
+        <w:pStyle w:val="aff2"/>
+        <w:rPr>
+          <w:rFonts w:hint="eastAsia"/>
+        </w:rPr>
+      </w:pPr>
+      <w:r>
+        <w:t xml:space="preserve">Figure </w:t>
+      </w:r>
+      <w:r>
+        <w:fldChar w:fldCharType="begin"/>
+      </w:r>
+      <w:r>
+        <w:instrText xml:space="preserve"> SEQ Figure \* ARABIC </w:instrText>
+      </w:r>
+      <w:r>
+        <w:fldChar w:fldCharType="separate"/>
+      </w:r>
+      <w:r>
+        <w:rPr>
+          <w:noProof/>
+        </w:rPr>
+        <w:t>7</w:t>
+      </w:r>
+      <w:r>
+        <w:fldChar w:fldCharType="end"/>
+      </w:r>
+      <w:r>
+        <w:t xml:space="preserve"> UML class diagram of FileWatcherService</w:t>
       </w:r>
     </w:p>
     <w:p>
@@ -9394,6 +9466,9 @@
       </w:r>
       <w:proofErr w:type="spellStart"/>
       <w:r>
+        <w:rPr>
+          <w:rStyle w:val="Code0"/>
+        </w:rPr>
         <w:t>TerminalService</w:t>
       </w:r>
       <w:proofErr w:type="spellEnd"/>
@@ -9403,57 +9478,186 @@
     </w:p>
     <w:p>
       <w:r>
-        <w:t>Responsibilities:</w:t>
-      </w:r>
-    </w:p>
-    <w:p>
-      <w:pPr>
-        <w:pStyle w:val="a9"/>
-        <w:numPr>
-          <w:ilvl w:val="0"/>
-          <w:numId w:val="23"/>
-        </w:numPr>
-      </w:pPr>
-      <w:r>
-        <w:t>Spawning shell processes within PTYs</w:t>
-      </w:r>
-    </w:p>
-    <w:p>
-      <w:pPr>
-        <w:pStyle w:val="a9"/>
-        <w:numPr>
-          <w:ilvl w:val="0"/>
-          <w:numId w:val="23"/>
-        </w:numPr>
-      </w:pPr>
-      <w:r>
+        <w:t xml:space="preserve">Considering that there might be multiple terminals in the project, the service maintains a </w:t>
+      </w:r>
+      <w:r>
+        <w:rPr>
+          <w:rStyle w:val="Code0"/>
+        </w:rPr>
+        <w:t>_terminals</w:t>
+      </w:r>
+      <w:r>
+        <w:t xml:space="preserve"> dictionary to track terminal instances and also a </w:t>
+      </w:r>
+      <w:r>
+        <w:rPr>
+          <w:rStyle w:val="Code0"/>
+        </w:rPr>
+        <w:t>_</w:t>
+      </w:r>
+      <w:proofErr w:type="spellStart"/>
+      <w:r>
+        <w:rPr>
+          <w:rStyle w:val="Code0"/>
+        </w:rPr>
+        <w:t>cts</w:t>
+      </w:r>
+      <w:proofErr w:type="spellEnd"/>
+      <w:r>
+        <w:t xml:space="preserve"> dictionary to hold the </w:t>
+      </w:r>
+      <w:proofErr w:type="spellStart"/>
+      <w:r>
+        <w:rPr>
+          <w:rStyle w:val="Code0"/>
+        </w:rPr>
+        <w:t>CancellationTokenSource</w:t>
+      </w:r>
+      <w:proofErr w:type="spellEnd"/>
+      <w:r>
+        <w:t xml:space="preserve"> for terminals.</w:t>
+      </w:r>
+    </w:p>
+    <w:p>
+      <w:r>
+        <w:t xml:space="preserve">The class has four functions that handles most of the terminal operations, </w:t>
+      </w:r>
+      <w:proofErr w:type="spellStart"/>
+      <w:r>
+        <w:rPr>
+          <w:rStyle w:val="Code0"/>
+        </w:rPr>
+        <w:t>StartTerminalAsync</w:t>
+      </w:r>
+      <w:proofErr w:type="spellEnd"/>
+      <w:r>
+        <w:t xml:space="preserve">, </w:t>
+      </w:r>
+      <w:proofErr w:type="spellStart"/>
+      <w:r>
+        <w:rPr>
+          <w:rStyle w:val="Code0"/>
+        </w:rPr>
+        <w:t>WriteInputAsync</w:t>
+      </w:r>
+      <w:proofErr w:type="spellEnd"/>
+      <w:r>
+        <w:t xml:space="preserve">, </w:t>
+      </w:r>
+      <w:r>
+        <w:rPr>
+          <w:rStyle w:val="Code0"/>
+        </w:rPr>
+        <w:t>Resize</w:t>
+      </w:r>
+      <w:r>
+        <w:t xml:space="preserve">, and </w:t>
+      </w:r>
+      <w:proofErr w:type="spellStart"/>
+      <w:r>
+        <w:rPr>
+          <w:rStyle w:val="Code0"/>
+        </w:rPr>
+        <w:t>KillTerminal</w:t>
+      </w:r>
+      <w:proofErr w:type="spellEnd"/>
+      <w:r>
+        <w:t>.</w:t>
+      </w:r>
+    </w:p>
+    <w:p>
+      <w:pPr>
+        <w:keepNext/>
+        <w:jc w:val="center"/>
+      </w:pPr>
+      <w:r>
+        <w:rPr>
+          <w:noProof/>
+        </w:rPr>
         <w:lastRenderedPageBreak/>
-        <w:t>Streaming terminal output to clients</w:t>
-      </w:r>
-    </w:p>
-    <w:p>
-      <w:pPr>
-        <w:pStyle w:val="a9"/>
-        <w:numPr>
-          <w:ilvl w:val="0"/>
-          <w:numId w:val="23"/>
-        </w:numPr>
-      </w:pPr>
-      <w:r>
-        <w:t>Handling input, resize events, and terminal cleanup</w:t>
-      </w:r>
-    </w:p>
-    <w:p>
-      <w:pPr>
-        <w:pStyle w:val="a9"/>
-        <w:numPr>
-          <w:ilvl w:val="0"/>
-          <w:numId w:val="23"/>
-        </w:numPr>
-      </w:pPr>
-      <w:r>
-        <w:t>Managing process lifecycle and shutdown</w:t>
-      </w:r>
+        <w:drawing>
+          <wp:inline distT="0" distB="0" distL="0" distR="0" wp14:anchorId="07825D3B" wp14:editId="1F658014">
+            <wp:extent cx="3328212" cy="3095625"/>
+            <wp:effectExtent l="0" t="0" r="5715" b="0"/>
+            <wp:docPr id="9" name="图片 9"/>
+            <wp:cNvGraphicFramePr>
+              <a:graphicFrameLocks xmlns:a="http://schemas.openxmlformats.org/drawingml/2006/main" noChangeAspect="1"/>
+            </wp:cNvGraphicFramePr>
+            <a:graphic xmlns:a="http://schemas.openxmlformats.org/drawingml/2006/main">
+              <a:graphicData uri="http://schemas.openxmlformats.org/drawingml/2006/picture">
+                <pic:pic xmlns:pic="http://schemas.openxmlformats.org/drawingml/2006/picture">
+                  <pic:nvPicPr>
+                    <pic:cNvPr id="0" name="Picture 7"/>
+                    <pic:cNvPicPr>
+                      <a:picLocks noChangeAspect="1" noChangeArrowheads="1"/>
+                    </pic:cNvPicPr>
+                  </pic:nvPicPr>
+                  <pic:blipFill>
+                    <a:blip r:embed="rId22" cstate="print">
+                      <a:extLst>
+                        <a:ext uri="{28A0092B-C50C-407E-A947-70E740481C1C}">
+                          <a14:useLocalDpi xmlns:a14="http://schemas.microsoft.com/office/drawing/2010/main" val="0"/>
+                        </a:ext>
+                      </a:extLst>
+                    </a:blip>
+                    <a:srcRect/>
+                    <a:stretch>
+                      <a:fillRect/>
+                    </a:stretch>
+                  </pic:blipFill>
+                  <pic:spPr bwMode="auto">
+                    <a:xfrm>
+                      <a:off x="0" y="0"/>
+                      <a:ext cx="3331524" cy="3098706"/>
+                    </a:xfrm>
+                    <a:prstGeom prst="rect">
+                      <a:avLst/>
+                    </a:prstGeom>
+                    <a:noFill/>
+                    <a:ln>
+                      <a:noFill/>
+                    </a:ln>
+                  </pic:spPr>
+                </pic:pic>
+              </a:graphicData>
+            </a:graphic>
+          </wp:inline>
+        </w:drawing>
+      </w:r>
+    </w:p>
+    <w:p>
+      <w:pPr>
+        <w:pStyle w:val="aff2"/>
+      </w:pPr>
+      <w:r>
+        <w:t xml:space="preserve">Figure </w:t>
+      </w:r>
+      <w:r>
+        <w:fldChar w:fldCharType="begin"/>
+      </w:r>
+      <w:r>
+        <w:instrText xml:space="preserve"> SEQ Figure \* ARABIC </w:instrText>
+      </w:r>
+      <w:r>
+        <w:fldChar w:fldCharType="separate"/>
+      </w:r>
+      <w:r>
+        <w:rPr>
+          <w:noProof/>
+        </w:rPr>
+        <w:t>8</w:t>
+      </w:r>
+      <w:r>
+        <w:fldChar w:fldCharType="end"/>
+      </w:r>
+      <w:r>
+        <w:t xml:space="preserve"> UML class diagram of </w:t>
+      </w:r>
+      <w:proofErr w:type="spellStart"/>
+      <w:r>
+        <w:t>TerminalService</w:t>
+      </w:r>
+      <w:proofErr w:type="spellEnd"/>
     </w:p>
     <w:p>
       <w:pPr>
@@ -9480,8 +9684,200 @@
         <w:t>let</w:t>
       </w:r>
       <w:r>
-        <w:t xml:space="preserve"> the code within the code block executable, we require a Python service to manage the virtual environment, handle temporary files, execute the code, and stream output to the client.</w:t>
-      </w:r>
+        <w:t xml:space="preserve"> the code within the code block executable, we require a </w:t>
+      </w:r>
+      <w:r>
+        <w:t>P</w:t>
+      </w:r>
+      <w:r>
+        <w:t>ython service to manage the virtual environment, handle temporary files, execute the code, and stream output to the client.</w:t>
+      </w:r>
+    </w:p>
+    <w:p>
+      <w:r>
+        <w:t xml:space="preserve">The structure of this service is similar to that of </w:t>
+      </w:r>
+      <w:proofErr w:type="spellStart"/>
+      <w:r>
+        <w:rPr>
+          <w:rStyle w:val="Code0"/>
+        </w:rPr>
+        <w:t>TerminalService</w:t>
+      </w:r>
+      <w:proofErr w:type="spellEnd"/>
+      <w:r>
+        <w:t xml:space="preserve">, as </w:t>
+      </w:r>
+      <w:r>
+        <w:rPr>
+          <w:rStyle w:val="Code0"/>
+        </w:rPr>
+        <w:t>P</w:t>
+      </w:r>
+      <w:r>
+        <w:rPr>
+          <w:rStyle w:val="Code0"/>
+        </w:rPr>
+        <w:t>ython</w:t>
+      </w:r>
+      <w:r>
+        <w:rPr>
+          <w:rStyle w:val="Code0"/>
+        </w:rPr>
+        <w:t>.exe</w:t>
+      </w:r>
+      <w:r>
+        <w:t xml:space="preserve"> is essentially a command-line</w:t>
+      </w:r>
+      <w:r>
+        <w:t xml:space="preserve"> program.</w:t>
+      </w:r>
+    </w:p>
+    <w:p>
+      <w:pPr>
+        <w:rPr>
+          <w:rStyle w:val="Code0"/>
+          <w:noProof/>
+        </w:rPr>
+      </w:pPr>
+      <w:r>
+        <w:t xml:space="preserve">In addition, the service provides the </w:t>
+      </w:r>
+      <w:proofErr w:type="spellStart"/>
+      <w:r>
+        <w:rPr>
+          <w:rStyle w:val="Code0"/>
+        </w:rPr>
+        <w:t>GetVenvPythonExecutable</w:t>
+      </w:r>
+      <w:proofErr w:type="spellEnd"/>
+      <w:r>
+        <w:t xml:space="preserve"> and functions for virtual environment management, as well as the </w:t>
+      </w:r>
+      <w:proofErr w:type="spellStart"/>
+      <w:r>
+        <w:rPr>
+          <w:rStyle w:val="Code0"/>
+        </w:rPr>
+        <w:t>ExecuteCodeAsync</w:t>
+      </w:r>
+      <w:proofErr w:type="spellEnd"/>
+      <w:r>
+        <w:t xml:space="preserve"> and </w:t>
+      </w:r>
+      <w:proofErr w:type="spellStart"/>
+      <w:r>
+        <w:rPr>
+          <w:rStyle w:val="Code0"/>
+        </w:rPr>
+        <w:t>RunProcessAsync</w:t>
+      </w:r>
+      <w:proofErr w:type="spellEnd"/>
+      <w:r>
+        <w:t xml:space="preserve"> functions for creating temporary files and executing code.</w:t>
+      </w:r>
+      <w:r>
+        <w:rPr>
+          <w:rStyle w:val="Code0"/>
+          <w:noProof/>
+        </w:rPr>
+        <w:t xml:space="preserve"> </w:t>
+      </w:r>
+    </w:p>
+    <w:p>
+      <w:pPr>
+        <w:keepNext/>
+        <w:jc w:val="center"/>
+      </w:pPr>
+      <w:r>
+        <w:rPr>
+          <w:rStyle w:val="Code0"/>
+          <w:noProof/>
+        </w:rPr>
+        <w:lastRenderedPageBreak/>
+        <w:drawing>
+          <wp:inline distT="0" distB="0" distL="0" distR="0" wp14:anchorId="22D7A6C0" wp14:editId="581E59BD">
+            <wp:extent cx="3562350" cy="3639278"/>
+            <wp:effectExtent l="0" t="0" r="0" b="0"/>
+            <wp:docPr id="11" name="图片 11"/>
+            <wp:cNvGraphicFramePr>
+              <a:graphicFrameLocks xmlns:a="http://schemas.openxmlformats.org/drawingml/2006/main" noChangeAspect="1"/>
+            </wp:cNvGraphicFramePr>
+            <a:graphic xmlns:a="http://schemas.openxmlformats.org/drawingml/2006/main">
+              <a:graphicData uri="http://schemas.openxmlformats.org/drawingml/2006/picture">
+                <pic:pic xmlns:pic="http://schemas.openxmlformats.org/drawingml/2006/picture">
+                  <pic:nvPicPr>
+                    <pic:cNvPr id="0" name="Picture 9"/>
+                    <pic:cNvPicPr>
+                      <a:picLocks noChangeAspect="1" noChangeArrowheads="1"/>
+                    </pic:cNvPicPr>
+                  </pic:nvPicPr>
+                  <pic:blipFill>
+                    <a:blip r:embed="rId23" cstate="print">
+                      <a:extLst>
+                        <a:ext uri="{28A0092B-C50C-407E-A947-70E740481C1C}">
+                          <a14:useLocalDpi xmlns:a14="http://schemas.microsoft.com/office/drawing/2010/main" val="0"/>
+                        </a:ext>
+                      </a:extLst>
+                    </a:blip>
+                    <a:srcRect/>
+                    <a:stretch>
+                      <a:fillRect/>
+                    </a:stretch>
+                  </pic:blipFill>
+                  <pic:spPr bwMode="auto">
+                    <a:xfrm>
+                      <a:off x="0" y="0"/>
+                      <a:ext cx="3570095" cy="3647190"/>
+                    </a:xfrm>
+                    <a:prstGeom prst="rect">
+                      <a:avLst/>
+                    </a:prstGeom>
+                    <a:noFill/>
+                    <a:ln>
+                      <a:noFill/>
+                    </a:ln>
+                  </pic:spPr>
+                </pic:pic>
+              </a:graphicData>
+            </a:graphic>
+          </wp:inline>
+        </w:drawing>
+      </w:r>
+    </w:p>
+    <w:p>
+      <w:pPr>
+        <w:pStyle w:val="aff2"/>
+      </w:pPr>
+      <w:r>
+        <w:t xml:space="preserve">Figure </w:t>
+      </w:r>
+      <w:r>
+        <w:fldChar w:fldCharType="begin"/>
+      </w:r>
+      <w:r>
+        <w:instrText xml:space="preserve"> SEQ Figure \* ARABIC </w:instrText>
+      </w:r>
+      <w:r>
+        <w:fldChar w:fldCharType="separate"/>
+      </w:r>
+      <w:r>
+        <w:rPr>
+          <w:noProof/>
+        </w:rPr>
+        <w:t>9</w:t>
+      </w:r>
+      <w:r>
+        <w:fldChar w:fldCharType="end"/>
+      </w:r>
+      <w:r>
+        <w:t xml:space="preserve"> UML class diagram of </w:t>
+      </w:r>
+      <w:proofErr w:type="spellStart"/>
+      <w:r>
+        <w:t>PythonVenvRunner</w:t>
+      </w:r>
+      <w:proofErr w:type="spellEnd"/>
     </w:p>
     <w:p>
       <w:pPr>
@@ -9538,7 +9934,7 @@
           <w:noProof/>
         </w:rPr>
         <w:drawing>
-          <wp:inline distT="0" distB="0" distL="0" distR="0" wp14:anchorId="2F174D87" wp14:editId="2AE797CE">
+          <wp:inline distT="0" distB="0" distL="0" distR="0" wp14:anchorId="2F174D87" wp14:editId="0F84AC4C">
             <wp:extent cx="2824480" cy="5295900"/>
             <wp:effectExtent l="0" t="0" r="0" b="0"/>
             <wp:docPr id="3" name="图片 3"/>
@@ -9555,7 +9951,7 @@
                     </pic:cNvPicPr>
                   </pic:nvPicPr>
                   <pic:blipFill>
-                    <a:blip r:embed="rId21" cstate="print">
+                    <a:blip r:embed="rId24" cstate="print">
                       <a:extLst>
                         <a:ext uri="{28A0092B-C50C-407E-A947-70E740481C1C}">
                           <a14:useLocalDpi xmlns:a14="http://schemas.microsoft.com/office/drawing/2010/main" val="0"/>
@@ -9607,7 +10003,7 @@
         <w:rPr>
           <w:noProof/>
         </w:rPr>
-        <w:t>7</w:t>
+        <w:t>10</w:t>
       </w:r>
       <w:r>
         <w:fldChar w:fldCharType="end"/>
@@ -9690,7 +10086,7 @@
       </w:pPr>
     </w:p>
     <w:sectPr>
-      <w:footerReference w:type="default" r:id="rId22"/>
+      <w:footerReference w:type="default" r:id="rId25"/>
       <w:pgSz w:w="11906" w:h="16838"/>
       <w:pgMar w:top="1440" w:right="1440" w:bottom="1440" w:left="1440" w:header="851" w:footer="992" w:gutter="0"/>
       <w:pgNumType w:start="0"/>

</xml_diff>